<commit_message>
feat(fidelity): add Office field round-trip evidence
</commit_message>
<xml_diff>
--- a/fidelity/fixtures/office-rich.docx
+++ b/fidelity/fixtures/office-rich.docx
@@ -50,6 +50,28 @@
           </m:r>
         </m:oMath>
       </m:oMathPara>
+    </w:p>
+    <w:p>
+      <w:bookmarkStart w:id="1" w:name="eq_energy"/>
+      <w:r>
+        <w:t>Equation </w:t>
+      </w:r>
+      <w:fldSimple w:instr=" SEQ Equation \* ARABIC ">
+        <w:r>
+          <w:t>1</w:t>
+        </w:r>
+      </w:fldSimple>
+      <w:bookmarkEnd w:id="1"/>
+    </w:p>
+    <w:p>
+      <w:r>
+        <w:t>See equation </w:t>
+      </w:r>
+      <w:fldSimple w:instr=" REF eq_energy \h ">
+        <w:r>
+          <w:t>1</w:t>
+        </w:r>
+      </w:fldSimple>
     </w:p>
     <w:p>
       <w:r>
@@ -88,6 +110,41 @@
     </w:p>
     <w:p>
       <w:r>
+        <w:drawing>
+          <wp:inline>
+            <wp:extent cx="1143000" cy="381000"/>
+            <wp:docPr id="2" name="Vector Formula SVG"/>
+            <a:graphic>
+              <a:graphicData uri="http://schemas.openxmlformats.org/drawingml/2006/picture">
+                <pic:pic>
+                  <pic:nvPicPr>
+                    <pic:cNvPr id="2" name="image2.svg"/>
+                    <pic:cNvPicPr/>
+                  </pic:nvPicPr>
+                  <pic:blipFill>
+                    <a:blip r:embed="rIdSvg"/>
+                    <a:stretch>
+                      <a:fillRect/>
+                    </a:stretch>
+                  </pic:blipFill>
+                  <pic:spPr>
+                    <a:xfrm>
+                      <a:off x="0" y="0"/>
+                      <a:ext cx="1143000" cy="381000"/>
+                    </a:xfrm>
+                    <a:prstGeom prst="rect">
+                      <a:avLst/>
+                    </a:prstGeom>
+                  </pic:spPr>
+                </pic:pic>
+              </a:graphicData>
+            </a:graphic>
+          </wp:inline>
+        </w:drawing>
+      </w:r>
+    </w:p>
+    <w:p>
+      <w:r>
         <w:footnoteReference w:id="1"/>
       </w:r>
       <w:commentRangeStart w:id="0"/>

</xml_diff>

<commit_message>
feat(fidelity): add counted Office batch evidence
</commit_message>
<xml_diff>
--- a/fidelity/fixtures/office-rich.docx
+++ b/fidelity/fixtures/office-rich.docx
@@ -144,6 +144,243 @@
       </w:r>
     </w:p>
     <w:p>
+      <m:oMathPara>
+        <m:oMath>
+          <m:r>
+            <m:t>batch_2+1</m:t>
+          </m:r>
+        </m:oMath>
+      </m:oMathPara>
+    </w:p>
+    <w:p>
+      <w:r>
+        <w:drawing>
+          <wp:inline>
+            <wp:extent cx="9525" cy="9525"/>
+            <wp:docPr id="3" name="Batch PNG 2"/>
+            <a:graphic>
+              <a:graphicData uri="http://schemas.openxmlformats.org/drawingml/2006/picture">
+                <pic:pic>
+                  <pic:nvPicPr>
+                    <pic:cNvPr id="3" name="image1.png"/>
+                    <pic:cNvPicPr/>
+                  </pic:nvPicPr>
+                  <pic:blipFill>
+                    <a:blip r:embed="rIdImage"/>
+                    <a:stretch>
+                      <a:fillRect/>
+                    </a:stretch>
+                  </pic:blipFill>
+                  <pic:spPr>
+                    <a:xfrm>
+                      <a:off x="0" y="0"/>
+                      <a:ext cx="9525" cy="9525"/>
+                    </a:xfrm>
+                    <a:prstGeom prst="rect">
+                      <a:avLst/>
+                    </a:prstGeom>
+                  </pic:spPr>
+                </pic:pic>
+              </a:graphicData>
+            </a:graphic>
+          </wp:inline>
+        </w:drawing>
+      </w:r>
+    </w:p>
+    <w:p>
+      <w:r>
+        <w:drawing>
+          <wp:inline>
+            <wp:extent cx="1143000" cy="381000"/>
+            <wp:docPr id="4" name="Batch SVG 2"/>
+            <a:graphic>
+              <a:graphicData uri="http://schemas.openxmlformats.org/drawingml/2006/picture">
+                <pic:pic>
+                  <pic:nvPicPr>
+                    <pic:cNvPr id="4" name="image2.svg"/>
+                    <pic:cNvPicPr/>
+                  </pic:nvPicPr>
+                  <pic:blipFill>
+                    <a:blip r:embed="rIdSvg"/>
+                    <a:stretch>
+                      <a:fillRect/>
+                    </a:stretch>
+                  </pic:blipFill>
+                  <pic:spPr>
+                    <a:xfrm>
+                      <a:off x="0" y="0"/>
+                      <a:ext cx="1143000" cy="381000"/>
+                    </a:xfrm>
+                    <a:prstGeom prst="rect">
+                      <a:avLst/>
+                    </a:prstGeom>
+                  </pic:spPr>
+                </pic:pic>
+              </a:graphicData>
+            </a:graphic>
+          </wp:inline>
+        </w:drawing>
+      </w:r>
+    </w:p>
+    <w:p>
+      <m:oMathPara>
+        <m:oMath>
+          <m:r>
+            <m:t>batch_3+1</m:t>
+          </m:r>
+        </m:oMath>
+      </m:oMathPara>
+    </w:p>
+    <w:p>
+      <w:r>
+        <w:drawing>
+          <wp:inline>
+            <wp:extent cx="9525" cy="9525"/>
+            <wp:docPr id="5" name="Batch PNG 3"/>
+            <a:graphic>
+              <a:graphicData uri="http://schemas.openxmlformats.org/drawingml/2006/picture">
+                <pic:pic>
+                  <pic:nvPicPr>
+                    <pic:cNvPr id="5" name="image1.png"/>
+                    <pic:cNvPicPr/>
+                  </pic:nvPicPr>
+                  <pic:blipFill>
+                    <a:blip r:embed="rIdImage"/>
+                    <a:stretch>
+                      <a:fillRect/>
+                    </a:stretch>
+                  </pic:blipFill>
+                  <pic:spPr>
+                    <a:xfrm>
+                      <a:off x="0" y="0"/>
+                      <a:ext cx="9525" cy="9525"/>
+                    </a:xfrm>
+                    <a:prstGeom prst="rect">
+                      <a:avLst/>
+                    </a:prstGeom>
+                  </pic:spPr>
+                </pic:pic>
+              </a:graphicData>
+            </a:graphic>
+          </wp:inline>
+        </w:drawing>
+      </w:r>
+    </w:p>
+    <w:p>
+      <w:r>
+        <w:drawing>
+          <wp:inline>
+            <wp:extent cx="1143000" cy="381000"/>
+            <wp:docPr id="6" name="Batch SVG 3"/>
+            <a:graphic>
+              <a:graphicData uri="http://schemas.openxmlformats.org/drawingml/2006/picture">
+                <pic:pic>
+                  <pic:nvPicPr>
+                    <pic:cNvPr id="6" name="image2.svg"/>
+                    <pic:cNvPicPr/>
+                  </pic:nvPicPr>
+                  <pic:blipFill>
+                    <a:blip r:embed="rIdSvg"/>
+                    <a:stretch>
+                      <a:fillRect/>
+                    </a:stretch>
+                  </pic:blipFill>
+                  <pic:spPr>
+                    <a:xfrm>
+                      <a:off x="0" y="0"/>
+                      <a:ext cx="1143000" cy="381000"/>
+                    </a:xfrm>
+                    <a:prstGeom prst="rect">
+                      <a:avLst/>
+                    </a:prstGeom>
+                  </pic:spPr>
+                </pic:pic>
+              </a:graphicData>
+            </a:graphic>
+          </wp:inline>
+        </w:drawing>
+      </w:r>
+    </w:p>
+    <w:p>
+      <m:oMathPara>
+        <m:oMath>
+          <m:r>
+            <m:t>batch_4+1</m:t>
+          </m:r>
+        </m:oMath>
+      </m:oMathPara>
+    </w:p>
+    <w:p>
+      <w:r>
+        <w:drawing>
+          <wp:inline>
+            <wp:extent cx="9525" cy="9525"/>
+            <wp:docPr id="7" name="Batch PNG 4"/>
+            <a:graphic>
+              <a:graphicData uri="http://schemas.openxmlformats.org/drawingml/2006/picture">
+                <pic:pic>
+                  <pic:nvPicPr>
+                    <pic:cNvPr id="7" name="image1.png"/>
+                    <pic:cNvPicPr/>
+                  </pic:nvPicPr>
+                  <pic:blipFill>
+                    <a:blip r:embed="rIdImage"/>
+                    <a:stretch>
+                      <a:fillRect/>
+                    </a:stretch>
+                  </pic:blipFill>
+                  <pic:spPr>
+                    <a:xfrm>
+                      <a:off x="0" y="0"/>
+                      <a:ext cx="9525" cy="9525"/>
+                    </a:xfrm>
+                    <a:prstGeom prst="rect">
+                      <a:avLst/>
+                    </a:prstGeom>
+                  </pic:spPr>
+                </pic:pic>
+              </a:graphicData>
+            </a:graphic>
+          </wp:inline>
+        </w:drawing>
+      </w:r>
+    </w:p>
+    <w:p>
+      <w:r>
+        <w:drawing>
+          <wp:inline>
+            <wp:extent cx="1143000" cy="381000"/>
+            <wp:docPr id="8" name="Batch SVG 4"/>
+            <a:graphic>
+              <a:graphicData uri="http://schemas.openxmlformats.org/drawingml/2006/picture">
+                <pic:pic>
+                  <pic:nvPicPr>
+                    <pic:cNvPr id="8" name="image2.svg"/>
+                    <pic:cNvPicPr/>
+                  </pic:nvPicPr>
+                  <pic:blipFill>
+                    <a:blip r:embed="rIdSvg"/>
+                    <a:stretch>
+                      <a:fillRect/>
+                    </a:stretch>
+                  </pic:blipFill>
+                  <pic:spPr>
+                    <a:xfrm>
+                      <a:off x="0" y="0"/>
+                      <a:ext cx="1143000" cy="381000"/>
+                    </a:xfrm>
+                    <a:prstGeom prst="rect">
+                      <a:avLst/>
+                    </a:prstGeom>
+                  </pic:spPr>
+                </pic:pic>
+              </a:graphicData>
+            </a:graphic>
+          </wp:inline>
+        </w:drawing>
+      </w:r>
+    </w:p>
+    <w:p>
       <w:r>
         <w:footnoteReference w:id="1"/>
       </w:r>

</xml_diff>

<commit_message>
feat(conversion): request safe Word field refresh
</commit_message>
<xml_diff>
--- a/fidelity/fixtures/office-rich.docx
+++ b/fidelity/fixtures/office-rich.docx
@@ -56,7 +56,7 @@
       <w:r>
         <w:t>Equation </w:t>
       </w:r>
-      <w:fldSimple w:instr=" SEQ Equation \* ARABIC ">
+      <w:fldSimple w:instr=" SEQ Equation \* ARABIC " w:dirty="true">
         <w:r>
           <w:t>1</w:t>
         </w:r>
@@ -67,7 +67,7 @@
       <w:r>
         <w:t>See equation </w:t>
       </w:r>
-      <w:fldSimple w:instr=" REF eq_energy \h ">
+      <w:fldSimple w:instr=" REF eq_energy \h " w:dirty="true">
         <w:r>
           <w:t>1</w:t>
         </w:r>

</xml_diff>